<commit_message>
Deploy preview for PR 61 🛫
</commit_message>
<xml_diff>
--- a/pr-preview/pr-61/Your-Book-Title-tracked-changes.docx
+++ b/pr-preview/pr-61/Your-Book-Title-tracked-changes.docx
@@ -2232,7 +2232,7 @@
           <w:numId w:val="1004"/>
         </w:numPr>
       </w:pPr>
-      <w:ins w:id="79" w:author="d-morrison" w:date="2026-09-15T01:20:42Z">
+      <w:ins w:id="79" w:author="d-morrison" w:date="2026-09-15T01:24:17Z">
         <w:r>
           <w:rPr>
             <w:b/>
@@ -2241,12 +2241,12 @@
           <w:t xml:space="preserve">Branch:</w:t>
         </w:r>
       </w:ins>
-      <w:ins w:id="79" w:author="d-morrison" w:date="2026-09-15T01:20:42Z">
+      <w:ins w:id="79" w:author="d-morrison" w:date="2026-09-15T01:24:17Z">
         <w:r>
           <w:t xml:space="preserve"> </w:t>
         </w:r>
       </w:ins>
-      <w:ins w:id="79" w:author="d-morrison" w:date="2026-09-15T01:20:42Z">
+      <w:ins w:id="79" w:author="d-morrison" w:date="2026-09-15T01:24:17Z">
         <w:r>
           <w:t xml:space="preserve">claude/fix-36-link-templates</w:t>
         </w:r>
@@ -2260,7 +2260,7 @@
           <w:numId w:val="1004"/>
         </w:numPr>
       </w:pPr>
-      <w:ins w:id="80" w:author="d-morrison" w:date="2026-09-15T01:20:42Z">
+      <w:ins w:id="80" w:author="d-morrison" w:date="2026-09-15T01:24:17Z">
         <w:r>
           <w:rPr>
             <w:b/>
@@ -2269,14 +2269,14 @@
           <w:t xml:space="preserve">Commit:</w:t>
         </w:r>
       </w:ins>
-      <w:ins w:id="80" w:author="d-morrison" w:date="2026-09-15T01:20:42Z">
+      <w:ins w:id="80" w:author="d-morrison" w:date="2026-09-15T01:24:17Z">
         <w:r>
           <w:t xml:space="preserve"> </w:t>
         </w:r>
       </w:ins>
-      <w:ins w:id="80" w:author="d-morrison" w:date="2026-09-15T01:20:42Z">
+      <w:ins w:id="80" w:author="d-morrison" w:date="2026-09-15T01:24:17Z">
         <w:r>
-          <w:t xml:space="preserve">ba51951</w:t>
+          <w:t xml:space="preserve">ca2f8e8</w:t>
         </w:r>
       </w:ins>
     </w:p>
@@ -2288,7 +2288,7 @@
           <w:numId w:val="1004"/>
         </w:numPr>
       </w:pPr>
-      <w:ins w:id="81" w:author="d-morrison" w:date="2026-09-15T01:20:42Z">
+      <w:ins w:id="81" w:author="d-morrison" w:date="2026-09-15T01:24:17Z">
         <w:r>
           <w:rPr>
             <w:b/>
@@ -2297,14 +2297,14 @@
           <w:t xml:space="preserve">Full commit hash:</w:t>
         </w:r>
       </w:ins>
-      <w:ins w:id="81" w:author="d-morrison" w:date="2026-09-15T01:20:42Z">
+      <w:ins w:id="81" w:author="d-morrison" w:date="2026-09-15T01:24:17Z">
         <w:r>
           <w:t xml:space="preserve"> </w:t>
         </w:r>
       </w:ins>
-      <w:ins w:id="81" w:author="d-morrison" w:date="2026-09-15T01:20:42Z">
+      <w:ins w:id="81" w:author="d-morrison" w:date="2026-09-15T01:24:17Z">
         <w:r>
-          <w:t xml:space="preserve">ba519515b5f3f5ece3b1182207af514ce253d4f0</w:t>
+          <w:t xml:space="preserve">ca2f8e80ac99f5b746bb7ea493cf885d699fa1b6</w:t>
         </w:r>
       </w:ins>
     </w:p>
@@ -2316,7 +2316,7 @@
           <w:numId w:val="1004"/>
         </w:numPr>
       </w:pPr>
-      <w:ins w:id="82" w:author="d-morrison" w:date="2026-09-15T01:20:42Z">
+      <w:ins w:id="82" w:author="d-morrison" w:date="2026-09-15T01:24:17Z">
         <w:r>
           <w:rPr>
             <w:b/>
@@ -2325,14 +2325,14 @@
           <w:t xml:space="preserve">Commit date:</w:t>
         </w:r>
       </w:ins>
-      <w:ins w:id="82" w:author="d-morrison" w:date="2026-09-15T01:20:42Z">
+      <w:ins w:id="82" w:author="d-morrison" w:date="2026-09-15T01:24:17Z">
         <w:r>
           <w:t xml:space="preserve"> </w:t>
         </w:r>
       </w:ins>
-      <w:ins w:id="82" w:author="d-morrison" w:date="2026-09-15T01:20:42Z">
+      <w:ins w:id="82" w:author="d-morrison" w:date="2026-09-15T01:24:17Z">
         <w:r>
-          <w:t xml:space="preserve">2026-09-14 18:18:00 -0700</w:t>
+          <w:t xml:space="preserve">2026-09-15 01:21:50 +0000</w:t>
         </w:r>
       </w:ins>
     </w:p>

</xml_diff>